<commit_message>
docs(srs): list the No Access and Session Ended pages
Co-Authored-By: Claude Opus 5.5 <noreply@anthropic.com>
</commit_message>
<xml_diff>
--- a/docs/SRS_V2.1.docx
+++ b/docs/SRS_V2.1.docx
@@ -4367,6 +4367,94 @@
                 <w:szCs w:val="20"/>
               </w:rPr>
               <w:t>Shown when a page that was never opened on this device is requested without a connection</w:t>
+            </w:r>
+          </w:p>
+        </w:tc>
+      </w:tr>
+      <w:tr>
+        <w:tc>
+          <w:tcPr>
+            <w:tcW w:w="2600" w:type="dxa"/>
+          </w:tcPr>
+          <w:p>
+            <w:pPr>
+              <w:rPr>
+                <w:color w:val="000000" w:themeColor="text1"/>
+              </w:rPr>
+            </w:pPr>
+            <w:r>
+              <w:rPr>
+                <w:rFonts w:ascii="Arial" w:eastAsia="Arial" w:hAnsi="Arial" w:cs="Arial"/>
+                <w:color w:val="000000" w:themeColor="text1"/>
+                <w:sz w:val="20"/>
+                <w:szCs w:val="20"/>
+              </w:rPr>
+              <w:t>No Access Page</w:t>
+            </w:r>
+          </w:p>
+        </w:tc>
+        <w:tc>
+          <w:tcPr>
+            <w:tcW w:w="6750" w:type="dxa"/>
+          </w:tcPr>
+          <w:p>
+            <w:pPr>
+              <w:rPr>
+                <w:color w:val="000000" w:themeColor="text1"/>
+              </w:rPr>
+            </w:pPr>
+            <w:r>
+              <w:rPr>
+                <w:rFonts w:ascii="Arial" w:eastAsia="Arial" w:hAnsi="Arial" w:cs="Arial"/>
+                <w:color w:val="000000" w:themeColor="text1"/>
+                <w:sz w:val="20"/>
+                <w:szCs w:val="20"/>
+              </w:rPr>
+              <w:t>Shown when Inventory/Sales Staff open an owner-only page; offers a link back to the dashboard</w:t>
+            </w:r>
+          </w:p>
+        </w:tc>
+      </w:tr>
+      <w:tr>
+        <w:tc>
+          <w:tcPr>
+            <w:tcW w:w="2600" w:type="dxa"/>
+          </w:tcPr>
+          <w:p>
+            <w:pPr>
+              <w:rPr>
+                <w:color w:val="000000" w:themeColor="text1"/>
+              </w:rPr>
+            </w:pPr>
+            <w:r>
+              <w:rPr>
+                <w:rFonts w:ascii="Arial" w:eastAsia="Arial" w:hAnsi="Arial" w:cs="Arial"/>
+                <w:color w:val="000000" w:themeColor="text1"/>
+                <w:sz w:val="20"/>
+                <w:szCs w:val="20"/>
+              </w:rPr>
+              <w:t>Session Ended Page</w:t>
+            </w:r>
+          </w:p>
+        </w:tc>
+        <w:tc>
+          <w:tcPr>
+            <w:tcW w:w="6750" w:type="dxa"/>
+          </w:tcPr>
+          <w:p>
+            <w:pPr>
+              <w:rPr>
+                <w:color w:val="000000" w:themeColor="text1"/>
+              </w:rPr>
+            </w:pPr>
+            <w:r>
+              <w:rPr>
+                <w:rFonts w:ascii="Arial" w:eastAsia="Arial" w:hAnsi="Arial" w:cs="Arial"/>
+                <w:color w:val="000000" w:themeColor="text1"/>
+                <w:sz w:val="20"/>
+                <w:szCs w:val="20"/>
+              </w:rPr>
+              <w:t>Shown when a user is signed out because their account was deactivated or their password was reset</w:t>
             </w:r>
           </w:p>
         </w:tc>

</xml_diff>